<commit_message>
Portail formateur — ajout de la journée 5
Co-Authored-By: Claude Opus 5.5 <noreply@anthropic.com>
Claude-Session: https://claude.ai/code/session_01F4nqF4fVcBrV9H1uwuQCoL
</commit_message>
<xml_diff>
--- a/PPR_Formateur/documents_a_remettre/PPR_J5_Book_stagiaire.docx
+++ b/PPR_Formateur/documents_a_remettre/PPR_J5_Book_stagiaire.docx
@@ -3227,7 +3227,47 @@
                 <w:sz w:val="18"/>
                 <w:szCs w:val="18"/>
               </w:rPr>
-              <w:t xml:space="preserve">Déductibles du revenu imposable, dans la limite de 10 % des revenus d'activité professionnelle de l'année précédente (limités à 8 PASS), avec un minimum de 10 % du PASS. Les plafonds non utilisés des trois années précédentes sont reportables</w:t>
+              <w:t xml:space="preserve">Déductibles du revenu imposable, dans la limite de 10 % des revenus d'activité professionnelle de l'année précédente (limités à 8 PASS), avec un minimum de 10 % du PASS. Depuis 2026 : plafonds non utilisés reportables sur </w:t>
+            </w:r>
+            <w:r>
+              <w:rPr>
+                <w:rFonts w:ascii="Nunito" w:cs="Nunito" w:eastAsia="Nunito" w:hAnsi="Nunito"/>
+                <w:b/>
+                <w:bCs/>
+                <w:color w:val="1D2433"/>
+                <w:sz w:val="18"/>
+                <w:szCs w:val="18"/>
+              </w:rPr>
+              <w:t xml:space="preserve">cinq ans</w:t>
+            </w:r>
+            <w:r>
+              <w:rPr>
+                <w:rFonts w:ascii="Nunito" w:cs="Nunito" w:eastAsia="Nunito" w:hAnsi="Nunito"/>
+                <w:color w:val="1D2433"/>
+                <w:sz w:val="18"/>
+                <w:szCs w:val="18"/>
+              </w:rPr>
+              <w:t xml:space="preserve"> (au lieu de trois) ; versements effectués </w:t>
+            </w:r>
+            <w:r>
+              <w:rPr>
+                <w:rFonts w:ascii="Nunito" w:cs="Nunito" w:eastAsia="Nunito" w:hAnsi="Nunito"/>
+                <w:b/>
+                <w:bCs/>
+                <w:color w:val="1D2433"/>
+                <w:sz w:val="18"/>
+                <w:szCs w:val="18"/>
+              </w:rPr>
+              <w:t xml:space="preserve">après 70 ans</w:t>
+            </w:r>
+            <w:r>
+              <w:rPr>
+                <w:rFonts w:ascii="Nunito" w:cs="Nunito" w:eastAsia="Nunito" w:hAnsi="Nunito"/>
+                <w:color w:val="1D2433"/>
+                <w:sz w:val="18"/>
+                <w:szCs w:val="18"/>
+              </w:rPr>
+              <w:t xml:space="preserve"> non déductibles</w:t>
             </w:r>
           </w:p>
         </w:tc>
@@ -3335,7 +3375,7 @@
                 <w:sz w:val="18"/>
                 <w:szCs w:val="18"/>
               </w:rPr>
-              <w:t xml:space="preserve">Le déblocage anticipé</w:t>
+              <w:t xml:space="preserve">La fiscalité d'une sortie en capital</w:t>
             </w:r>
           </w:p>
         </w:tc>
@@ -3367,7 +3407,47 @@
                 <w:sz w:val="18"/>
                 <w:szCs w:val="18"/>
               </w:rPr>
-              <w:t xml:space="preserve">Acquisition de la résidence principale (sauf sommes issues des versements obligatoires) ; accidents de la vie : décès du conjoint ou du partenaire de PACS, invalidité, surendettement, fin des droits au chômage, cessation d'activité non salariée après liquidation judiciaire</w:t>
+              <w:t xml:space="preserve">Part correspondant aux versements déduits : impôt sur le revenu au barème. Gains : prélèvement forfaitaire unique de </w:t>
+            </w:r>
+            <w:r>
+              <w:rPr>
+                <w:rFonts w:ascii="Nunito" w:cs="Nunito" w:eastAsia="Nunito" w:hAnsi="Nunito"/>
+                <w:b/>
+                <w:bCs/>
+                <w:color w:val="1D2433"/>
+                <w:sz w:val="18"/>
+                <w:szCs w:val="18"/>
+              </w:rPr>
+              <w:t xml:space="preserve">31,4 %</w:t>
+            </w:r>
+            <w:r>
+              <w:rPr>
+                <w:rFonts w:ascii="Nunito" w:cs="Nunito" w:eastAsia="Nunito" w:hAnsi="Nunito"/>
+                <w:color w:val="1D2433"/>
+                <w:sz w:val="18"/>
+                <w:szCs w:val="18"/>
+              </w:rPr>
+              <w:t xml:space="preserve"> depuis le 1er janvier 2026 (12,8 % d'impôt + </w:t>
+            </w:r>
+            <w:r>
+              <w:rPr>
+                <w:rFonts w:ascii="Nunito" w:cs="Nunito" w:eastAsia="Nunito" w:hAnsi="Nunito"/>
+                <w:b/>
+                <w:bCs/>
+                <w:color w:val="1D2433"/>
+                <w:sz w:val="18"/>
+                <w:szCs w:val="18"/>
+              </w:rPr>
+              <w:t xml:space="preserve">18,6 %</w:t>
+            </w:r>
+            <w:r>
+              <w:rPr>
+                <w:rFonts w:ascii="Nunito" w:cs="Nunito" w:eastAsia="Nunito" w:hAnsi="Nunito"/>
+                <w:color w:val="1D2433"/>
+                <w:sz w:val="18"/>
+                <w:szCs w:val="18"/>
+              </w:rPr>
+              <w:t xml:space="preserve"> de prélèvements sociaux, contre 17,2 % auparavant). Versements non déduits : seuls les gains sont imposés</w:t>
             </w:r>
           </w:p>
         </w:tc>
@@ -3405,6 +3485,76 @@
                 <w:sz w:val="18"/>
                 <w:szCs w:val="18"/>
               </w:rPr>
+              <w:t xml:space="preserve">Le déblocage anticipé</w:t>
+            </w:r>
+          </w:p>
+        </w:tc>
+        <w:tc>
+          <w:tcPr>
+            <w:tcW w:type="dxa" w:w="7038"/>
+            <w:tcBorders>
+              <w:top w:val="single" w:color="C9D3E3" w:sz="4"/>
+              <w:left w:val="single" w:color="C9D3E3" w:sz="4"/>
+              <w:bottom w:val="single" w:color="C9D3E3" w:sz="4"/>
+              <w:right w:val="single" w:color="C9D3E3" w:sz="4"/>
+            </w:tcBorders>
+            <w:shd w:fill="FFFFFF" w:color="auto" w:val="clear"/>
+            <w:tcMar>
+              <w:top w:type="dxa" w:w="60"/>
+              <w:left w:type="dxa" w:w="100"/>
+              <w:bottom w:type="dxa" w:w="60"/>
+              <w:right w:type="dxa" w:w="100"/>
+            </w:tcMar>
+          </w:tcPr>
+          <w:p>
+            <w:pPr>
+              <w:spacing w:after="20" w:line="252"/>
+            </w:pPr>
+            <w:r>
+              <w:rPr>
+                <w:rFonts w:ascii="Nunito" w:cs="Nunito" w:eastAsia="Nunito" w:hAnsi="Nunito"/>
+                <w:color w:val="1D2433"/>
+                <w:sz w:val="18"/>
+                <w:szCs w:val="18"/>
+              </w:rPr>
+              <w:t xml:space="preserve">Acquisition de la résidence principale (sauf sommes issues des versements obligatoires) ; accidents de la vie : décès du conjoint ou du partenaire de PACS, invalidité, surendettement, fin des droits au chômage, cessation d'activité non salariée après liquidation judiciaire</w:t>
+            </w:r>
+          </w:p>
+        </w:tc>
+      </w:tr>
+      <w:tr>
+        <w:trPr>
+          <w:cantSplit/>
+          <w:tblHeader w:val="off"/>
+        </w:trPr>
+        <w:tc>
+          <w:tcPr>
+            <w:tcW w:type="dxa" w:w="2600"/>
+            <w:tcBorders>
+              <w:top w:val="single" w:color="C9D3E3" w:sz="4"/>
+              <w:left w:val="single" w:color="C9D3E3" w:sz="4"/>
+              <w:bottom w:val="single" w:color="C9D3E3" w:sz="4"/>
+              <w:right w:val="single" w:color="C9D3E3" w:sz="4"/>
+            </w:tcBorders>
+            <w:shd w:fill="E8F1FC" w:color="auto" w:val="clear"/>
+            <w:tcMar>
+              <w:top w:type="dxa" w:w="60"/>
+              <w:left w:type="dxa" w:w="100"/>
+              <w:bottom w:type="dxa" w:w="60"/>
+              <w:right w:type="dxa" w:w="100"/>
+            </w:tcMar>
+          </w:tcPr>
+          <w:p>
+            <w:pPr>
+              <w:spacing w:after="20" w:line="252"/>
+            </w:pPr>
+            <w:r>
+              <w:rPr>
+                <w:rFonts w:ascii="Nunito" w:cs="Nunito" w:eastAsia="Nunito" w:hAnsi="Nunito"/>
+                <w:color w:val="1D2433"/>
+                <w:sz w:val="18"/>
+                <w:szCs w:val="18"/>
+              </w:rPr>
               <w:t xml:space="preserve">Les pièces</w:t>
             </w:r>
           </w:p>
@@ -3418,7 +3568,7 @@
               <w:bottom w:val="single" w:color="C9D3E3" w:sz="4"/>
               <w:right w:val="single" w:color="C9D3E3" w:sz="4"/>
             </w:tcBorders>
-            <w:shd w:fill="FFFFFF" w:color="auto" w:val="clear"/>
+            <w:shd w:fill="E8F1FC" w:color="auto" w:val="clear"/>
             <w:tcMar>
               <w:top w:type="dxa" w:w="60"/>
               <w:left w:type="dxa" w:w="100"/>

</xml_diff>